<commit_message>
update to project summary
</commit_message>
<xml_diff>
--- a/projects/children_resp_adms.docx
+++ b/projects/children_resp_adms.docx
@@ -50,16 +50,42 @@
           <w:sz w:val="24"/>
           <w:szCs w:val="24"/>
         </w:rPr>
-        <w:t xml:space="preserve">This project investigates whether children living in households with adult smokers have an increased risk of acute respiratory illness, </w:t>
-      </w:r>
-      <w:r>
-        <w:rPr>
-          <w:rFonts w:ascii="Arial" w:hAnsi="Arial" w:cs="Arial"/>
-          <w:sz w:val="24"/>
-          <w:szCs w:val="24"/>
-          <w:lang w:val="en-GB"/>
-        </w:rPr>
-        <w:t xml:space="preserve">using linked health and demographic data for approximately 200,000 children aged 0–17 years in BNSSG, </w:t>
+        <w:t>This project investigates whether children living in households with adult smokers have an increased risk of acute respiratory illness</w:t>
+      </w:r>
+      <w:r>
+        <w:rPr>
+          <w:rFonts w:ascii="Arial" w:hAnsi="Arial" w:cs="Arial"/>
+          <w:sz w:val="24"/>
+          <w:szCs w:val="24"/>
+        </w:rPr>
+        <w:t xml:space="preserve">.  It </w:t>
+      </w:r>
+      <w:r>
+        <w:rPr>
+          <w:rFonts w:ascii="Arial" w:hAnsi="Arial" w:cs="Arial"/>
+          <w:sz w:val="24"/>
+          <w:szCs w:val="24"/>
+          <w:lang w:val="en-GB"/>
+        </w:rPr>
+        <w:t>us</w:t>
+      </w:r>
+      <w:r>
+        <w:rPr>
+          <w:rFonts w:ascii="Arial" w:hAnsi="Arial" w:cs="Arial"/>
+          <w:sz w:val="24"/>
+          <w:szCs w:val="24"/>
+          <w:lang w:val="en-GB"/>
+        </w:rPr>
+        <w:t>es</w:t>
+      </w:r>
+      <w:r>
+        <w:rPr>
+          <w:rFonts w:ascii="Arial" w:hAnsi="Arial" w:cs="Arial"/>
+          <w:sz w:val="24"/>
+          <w:szCs w:val="24"/>
+          <w:lang w:val="en-GB"/>
+        </w:rPr>
+        <w:t xml:space="preserve"> linked health and demographic data for approximately 200,000 children aged 0–17 years in BNSSG, </w:t>
       </w:r>
       <w:r>
         <w:rPr>
@@ -101,7 +127,16 @@
           <w:szCs w:val="24"/>
           <w:lang w:val="en-GB"/>
         </w:rPr>
-        <w:t>ed</w:t>
+        <w:t>e</w:t>
+      </w:r>
+      <w:r>
+        <w:rPr>
+          <w:rFonts w:ascii="Arial" w:hAnsi="Arial" w:cs="Arial"/>
+          <w:sz w:val="24"/>
+          <w:szCs w:val="24"/>
+          <w:lang w:val="en-GB"/>
+        </w:rPr>
+        <w:t>s</w:t>
       </w:r>
       <w:r>
         <w:rPr>
@@ -659,7 +694,25 @@
           <w:szCs w:val="24"/>
           <w:lang w:val="en-GB"/>
         </w:rPr>
-        <w:t>A logistic regression model was developed to predict risk of unplanned respiratory activity. Model performance demonstrated good discrimination (AUC ≈ 0.80), with strong sensitivity to threshold selection. Techniques to address class imbalance significantly improved detection of respiratory events but increased false positives, highlighting trade-offs between recall and precision in operational use.</w:t>
+        <w:t xml:space="preserve">A logistic regression model was developed to predict risk of unplanned respiratory activity. Model performance demonstrated good discrimination (AUC ≈ 0.80), with strong sensitivity to threshold selection. </w:t>
+      </w:r>
+      <w:r>
+        <w:rPr>
+          <w:rFonts w:ascii="Arial" w:hAnsi="Arial" w:cs="Arial"/>
+          <w:sz w:val="24"/>
+          <w:szCs w:val="24"/>
+          <w:lang w:val="en-GB"/>
+        </w:rPr>
+        <w:t xml:space="preserve"> </w:t>
+      </w:r>
+      <w:r>
+        <w:rPr>
+          <w:rFonts w:ascii="Arial" w:hAnsi="Arial" w:cs="Arial"/>
+          <w:sz w:val="24"/>
+          <w:szCs w:val="24"/>
+          <w:lang w:val="en-GB"/>
+        </w:rPr>
+        <w:t>Techniques to address class imbalance significantly improved detection of respiratory events but increased false positives, highlighting trade-offs between recall and precision in operational use.</w:t>
       </w:r>
     </w:p>
     <w:p>
@@ -779,6 +832,7 @@
         <w:rPr>
           <w:noProof/>
         </w:rPr>
+        <w:lastRenderedPageBreak/>
         <w:drawing>
           <wp:inline distT="0" distB="0" distL="0" distR="0" wp14:anchorId="1540D81A" wp14:editId="73AF0C7F">
             <wp:extent cx="6312959" cy="3590925"/>
@@ -859,7 +913,43 @@
           <w:szCs w:val="24"/>
           <w:lang w:val="en-GB"/>
         </w:rPr>
-        <w:t>Scenario modelling demonstrated that the value of predictive analytics depends on how models are deployed. Lower classification thresholds maximise case detection but generate high volumes of false positives, leading to inefficient targeting. Higher thresholds provide a more balanced approach, enabling clinically meaningful impact without incurring additional system cost.</w:t>
+        <w:t xml:space="preserve">Scenario modelling demonstrated that the value of predictive analytics depends on how models are deployed. </w:t>
+      </w:r>
+      <w:r>
+        <w:rPr>
+          <w:rFonts w:ascii="Arial" w:hAnsi="Arial" w:cs="Arial"/>
+          <w:sz w:val="24"/>
+          <w:szCs w:val="24"/>
+          <w:lang w:val="en-GB"/>
+        </w:rPr>
+        <w:t xml:space="preserve"> </w:t>
+      </w:r>
+      <w:r>
+        <w:rPr>
+          <w:rFonts w:ascii="Arial" w:hAnsi="Arial" w:cs="Arial"/>
+          <w:sz w:val="24"/>
+          <w:szCs w:val="24"/>
+          <w:lang w:val="en-GB"/>
+        </w:rPr>
+        <w:t xml:space="preserve">Lower classification thresholds maximise case detection but generate high volumes of false positives, leading to inefficient targeting. </w:t>
+      </w:r>
+      <w:r>
+        <w:rPr>
+          <w:rFonts w:ascii="Arial" w:hAnsi="Arial" w:cs="Arial"/>
+          <w:sz w:val="24"/>
+          <w:szCs w:val="24"/>
+          <w:lang w:val="en-GB"/>
+        </w:rPr>
+        <w:t xml:space="preserve"> </w:t>
+      </w:r>
+      <w:r>
+        <w:rPr>
+          <w:rFonts w:ascii="Arial" w:hAnsi="Arial" w:cs="Arial"/>
+          <w:sz w:val="24"/>
+          <w:szCs w:val="24"/>
+          <w:lang w:val="en-GB"/>
+        </w:rPr>
+        <w:t>Higher thresholds provide a more balanced approach, enabling clinically meaningful impact without incurring additional system cost.</w:t>
       </w:r>
     </w:p>
     <w:p>
@@ -948,21 +1038,6 @@
         <w:t>The analysis estimates that targeted interventions for children at highest risk could reduce respiratory admissions and attendances, with potential system savings of approximately £83k per annum, subject to intervention effectiveness.</w:t>
       </w:r>
     </w:p>
-    <w:p>
-      <w:pPr>
-        <w:pStyle w:val="Heading2"/>
-      </w:pPr>
-      <w:bookmarkStart w:id="2" w:name="_Toc224908832"/>
-      <w:bookmarkStart w:id="3" w:name="_Toc229057872"/>
-      <w:r>
-        <w:t>Discussion</w:t>
-      </w:r>
-      <w:bookmarkEnd w:id="2"/>
-      <w:r>
-        <w:t xml:space="preserve"> &amp; reflection</w:t>
-      </w:r>
-      <w:bookmarkEnd w:id="3"/>
-    </w:p>
     <w:bookmarkEnd w:id="0"/>
     <w:bookmarkEnd w:id="1"/>
     <w:p>
@@ -1065,7 +1140,11 @@
         <w:pStyle w:val="BodyText"/>
       </w:pPr>
       <w:r>
-        <w:t>Alternative approaches, such as random forests or gradient boosting, were considered; however, logistic regression was selected due to its interpretability, which is critical in a healthcare decision-making context.</w:t>
+        <w:t xml:space="preserve">Alternative approaches, such as random forests or gradient boosting, were considered; however, logistic regression was selected due to its interpretability, </w:t>
+      </w:r>
+      <w:r>
+        <w:lastRenderedPageBreak/>
+        <w:t>which is critical in a healthcare decision-making context.</w:t>
       </w:r>
     </w:p>
     <w:p>
@@ -1108,7 +1187,7 @@
         <w:autoSpaceDN/>
         <w:spacing w:after="160" w:line="259" w:lineRule="auto"/>
       </w:pPr>
-      <w:bookmarkStart w:id="4" w:name="_Toc224908833"/>
+      <w:bookmarkStart w:id="2" w:name="_Toc224908833"/>
       <w:r>
         <w:rPr>
           <w:rFonts w:ascii="Arial" w:hAnsi="Arial" w:cs="Arial"/>
@@ -1153,21 +1232,16 @@
       <w:pPr>
         <w:pStyle w:val="Heading2"/>
       </w:pPr>
-      <w:bookmarkStart w:id="5" w:name="_Toc229057873"/>
+      <w:bookmarkStart w:id="3" w:name="_Toc229057873"/>
       <w:r>
         <w:lastRenderedPageBreak/>
         <w:t>Referenc</w:t>
       </w:r>
       <w:r>
-        <w:t>es – impact project</w:t>
-      </w:r>
-      <w:bookmarkEnd w:id="4"/>
-      <w:bookmarkEnd w:id="5"/>
-    </w:p>
-    <w:p>
-      <w:pPr>
-        <w:pStyle w:val="Heading2"/>
-      </w:pPr>
+        <w:t>es</w:t>
+      </w:r>
+      <w:bookmarkEnd w:id="2"/>
+      <w:bookmarkEnd w:id="3"/>
     </w:p>
     <w:p>
       <w:pPr>
@@ -1607,6 +1681,7 @@
           <w:rFonts w:ascii="Arial" w:hAnsi="Arial" w:cs="Arial"/>
           <w:sz w:val="24"/>
         </w:rPr>
+        <w:lastRenderedPageBreak/>
         <w:t xml:space="preserve">Henninger, F. (2023) ‘Born-fair Data Projects Using Cookiecutter Templates’, </w:t>
       </w:r>
       <w:r>
@@ -1655,15 +1730,7 @@
           <w:rFonts w:ascii="Arial" w:hAnsi="Arial" w:cs="Arial"/>
           <w:sz w:val="24"/>
         </w:rPr>
-        <w:t xml:space="preserve">. </w:t>
-      </w:r>
-      <w:r>
-        <w:rPr>
-          <w:rFonts w:ascii="Arial" w:hAnsi="Arial" w:cs="Arial"/>
-          <w:sz w:val="24"/>
-        </w:rPr>
-        <w:lastRenderedPageBreak/>
-        <w:t>ICO. Available at: https://ico.org.uk/for-organisations/uk-gdpr-guidance-and-resources/data-protection-principles/a-guide-to-the-data-protection-principles/ (Accessed: 21 July 2025).</w:t>
+        <w:t>. ICO. Available at: https://ico.org.uk/for-organisations/uk-gdpr-guidance-and-resources/data-protection-principles/a-guide-to-the-data-protection-principles/ (Accessed: 21 July 2025).</w:t>
       </w:r>
     </w:p>
     <w:p>
@@ -1983,7 +2050,15 @@
           <w:rFonts w:ascii="Arial" w:hAnsi="Arial" w:cs="Arial"/>
           <w:sz w:val="24"/>
         </w:rPr>
-        <w:t>Srivastava, A. (2024) ‘Use of Python in Data Science, Data Integration and Data Engineer – IJSREM’. Available at: https://ijsrem.com/download/use-of-python-in-data-science-data-integration-and-data-engineer/ (Accessed: 16 March 2026).</w:t>
+        <w:t>Srivastava, A. (2024) ‘Use of Python in Data Science, Data Integration and Data Engineer – IJSREM’. Available at: https://ijsrem.com/download/use-of-python-in-</w:t>
+      </w:r>
+      <w:r>
+        <w:rPr>
+          <w:rFonts w:ascii="Arial" w:hAnsi="Arial" w:cs="Arial"/>
+          <w:sz w:val="24"/>
+        </w:rPr>
+        <w:lastRenderedPageBreak/>
+        <w:t>data-science-data-integration-and-data-engineer/ (Accessed: 16 March 2026).</w:t>
       </w:r>
     </w:p>
     <w:p>
@@ -2072,211 +2147,6 @@
       </w:pPr>
       <w:r>
         <w:fldChar w:fldCharType="end"/>
-      </w:r>
-      <w:r>
-        <w:br w:type="page"/>
-      </w:r>
-      <w:bookmarkStart w:id="6" w:name="_Toc224908834"/>
-      <w:bookmarkStart w:id="7" w:name="_Toc229057874"/>
-      <w:r>
-        <w:lastRenderedPageBreak/>
-        <w:t>Appendix 2: impact project</w:t>
-      </w:r>
-      <w:bookmarkEnd w:id="6"/>
-      <w:bookmarkEnd w:id="7"/>
-    </w:p>
-    <w:p>
-      <w:pPr>
-        <w:pStyle w:val="Heading2"/>
-      </w:pPr>
-    </w:p>
-    <w:p>
-      <w:pPr>
-        <w:pStyle w:val="Heading3"/>
-      </w:pPr>
-      <w:bookmarkStart w:id="8" w:name="_Toc229057875"/>
-      <w:r>
-        <w:t>Data model</w:t>
-      </w:r>
-      <w:bookmarkEnd w:id="8"/>
-      <w:r>
-        <w:t xml:space="preserve"> </w:t>
-      </w:r>
-    </w:p>
-    <w:p>
-      <w:pPr>
-        <w:pStyle w:val="BodyText"/>
-      </w:pPr>
-      <w:r>
-        <w:rPr>
-          <w:noProof/>
-        </w:rPr>
-        <w:drawing>
-          <wp:inline distT="0" distB="0" distL="0" distR="0" wp14:anchorId="104F0761" wp14:editId="42DADAD2">
-            <wp:extent cx="4134678" cy="4309005"/>
-            <wp:effectExtent l="0" t="0" r="0" b="0"/>
-            <wp:docPr id="874193956" name="Picture 1"/>
-            <wp:cNvGraphicFramePr>
-              <a:graphicFrameLocks xmlns:a="http://schemas.openxmlformats.org/drawingml/2006/main" noChangeAspect="1"/>
-            </wp:cNvGraphicFramePr>
-            <a:graphic xmlns:a="http://schemas.openxmlformats.org/drawingml/2006/main">
-              <a:graphicData uri="http://schemas.openxmlformats.org/drawingml/2006/picture">
-                <pic:pic xmlns:pic="http://schemas.openxmlformats.org/drawingml/2006/picture">
-                  <pic:nvPicPr>
-                    <pic:cNvPr id="874193956" name=""/>
-                    <pic:cNvPicPr/>
-                  </pic:nvPicPr>
-                  <pic:blipFill>
-                    <a:blip r:embed="rId12"/>
-                    <a:stretch>
-                      <a:fillRect/>
-                    </a:stretch>
-                  </pic:blipFill>
-                  <pic:spPr>
-                    <a:xfrm>
-                      <a:off x="0" y="0"/>
-                      <a:ext cx="4141760" cy="4316386"/>
-                    </a:xfrm>
-                    <a:prstGeom prst="rect">
-                      <a:avLst/>
-                    </a:prstGeom>
-                  </pic:spPr>
-                </pic:pic>
-              </a:graphicData>
-            </a:graphic>
-          </wp:inline>
-        </w:drawing>
-      </w:r>
-    </w:p>
-    <w:p>
-      <w:pPr>
-        <w:pStyle w:val="Heading3"/>
-      </w:pPr>
-      <w:bookmarkStart w:id="9" w:name="_Toc229057876"/>
-      <w:r>
-        <w:t>Data lineage</w:t>
-      </w:r>
-      <w:bookmarkEnd w:id="9"/>
-    </w:p>
-    <w:p>
-      <w:pPr>
-        <w:pStyle w:val="Heading2"/>
-      </w:pPr>
-    </w:p>
-    <w:p>
-      <w:pPr>
-        <w:pStyle w:val="BodyText"/>
-      </w:pPr>
-      <w:r>
-        <w:rPr>
-          <w:noProof/>
-        </w:rPr>
-        <w:drawing>
-          <wp:inline distT="0" distB="0" distL="0" distR="0" wp14:anchorId="6109882C" wp14:editId="45B9F0AD">
-            <wp:extent cx="6415504" cy="2428875"/>
-            <wp:effectExtent l="0" t="0" r="4445" b="0"/>
-            <wp:docPr id="244124923" name="Picture 1"/>
-            <wp:cNvGraphicFramePr>
-              <a:graphicFrameLocks xmlns:a="http://schemas.openxmlformats.org/drawingml/2006/main" noChangeAspect="1"/>
-            </wp:cNvGraphicFramePr>
-            <a:graphic xmlns:a="http://schemas.openxmlformats.org/drawingml/2006/main">
-              <a:graphicData uri="http://schemas.openxmlformats.org/drawingml/2006/picture">
-                <pic:pic xmlns:pic="http://schemas.openxmlformats.org/drawingml/2006/picture">
-                  <pic:nvPicPr>
-                    <pic:cNvPr id="244124923" name=""/>
-                    <pic:cNvPicPr/>
-                  </pic:nvPicPr>
-                  <pic:blipFill>
-                    <a:blip r:embed="rId13"/>
-                    <a:stretch>
-                      <a:fillRect/>
-                    </a:stretch>
-                  </pic:blipFill>
-                  <pic:spPr>
-                    <a:xfrm>
-                      <a:off x="0" y="0"/>
-                      <a:ext cx="6422554" cy="2431544"/>
-                    </a:xfrm>
-                    <a:prstGeom prst="rect">
-                      <a:avLst/>
-                    </a:prstGeom>
-                  </pic:spPr>
-                </pic:pic>
-              </a:graphicData>
-            </a:graphic>
-          </wp:inline>
-        </w:drawing>
-      </w:r>
-    </w:p>
-    <w:p>
-      <w:pPr>
-        <w:pStyle w:val="BodyText"/>
-      </w:pPr>
-    </w:p>
-    <w:p>
-      <w:pPr>
-        <w:pStyle w:val="BodyText"/>
-        <w:sectPr>
-          <w:pgSz w:w="11910" w:h="16840"/>
-          <w:pgMar w:top="1300" w:right="1320" w:bottom="280" w:left="1340" w:header="708" w:footer="0" w:gutter="0"/>
-          <w:cols w:space="720"/>
-        </w:sectPr>
-      </w:pPr>
-    </w:p>
-    <w:p>
-      <w:pPr>
-        <w:pStyle w:val="Heading3"/>
-      </w:pPr>
-      <w:bookmarkStart w:id="10" w:name="_Toc229057877"/>
-      <w:r>
-        <w:lastRenderedPageBreak/>
-        <w:t>Feature</w:t>
-      </w:r>
-      <w:r>
-        <w:t xml:space="preserve"> transformations log</w:t>
-      </w:r>
-      <w:bookmarkEnd w:id="10"/>
-    </w:p>
-    <w:p>
-      <w:r>
-        <w:rPr>
-          <w:noProof/>
-        </w:rPr>
-        <w:drawing>
-          <wp:inline distT="0" distB="0" distL="0" distR="0" wp14:anchorId="0B5D44A6" wp14:editId="1ECDD5F4">
-            <wp:extent cx="5731510" cy="3219087"/>
-            <wp:effectExtent l="0" t="0" r="2540" b="635"/>
-            <wp:docPr id="134479587" name="Picture 1"/>
-            <wp:cNvGraphicFramePr>
-              <a:graphicFrameLocks xmlns:a="http://schemas.openxmlformats.org/drawingml/2006/main" noChangeAspect="1"/>
-            </wp:cNvGraphicFramePr>
-            <a:graphic xmlns:a="http://schemas.openxmlformats.org/drawingml/2006/main">
-              <a:graphicData uri="http://schemas.openxmlformats.org/drawingml/2006/picture">
-                <pic:pic xmlns:pic="http://schemas.openxmlformats.org/drawingml/2006/picture">
-                  <pic:nvPicPr>
-                    <pic:cNvPr id="134479587" name=""/>
-                    <pic:cNvPicPr/>
-                  </pic:nvPicPr>
-                  <pic:blipFill>
-                    <a:blip r:embed="rId14"/>
-                    <a:stretch>
-                      <a:fillRect/>
-                    </a:stretch>
-                  </pic:blipFill>
-                  <pic:spPr>
-                    <a:xfrm>
-                      <a:off x="0" y="0"/>
-                      <a:ext cx="5731510" cy="3219087"/>
-                    </a:xfrm>
-                    <a:prstGeom prst="rect">
-                      <a:avLst/>
-                    </a:prstGeom>
-                  </pic:spPr>
-                </pic:pic>
-              </a:graphicData>
-            </a:graphic>
-          </wp:inline>
-        </w:drawing>
       </w:r>
     </w:p>
     <w:sectPr>

</xml_diff>